<commit_message>
chore(report): add phase 5 cli evidence
</commit_message>
<xml_diff>
--- a/docs/reports/phase-5-agentic-cli/phase-5-agentic-cli-report.docx
+++ b/docs/reports/phase-5-agentic-cli/phase-5-agentic-cli-report.docx
@@ -365,6 +365,22 @@
         <w:t>`docs/reports/phase-5-agentic-cli/phase-5-agentic-cli-report.md`</w:t>
       </w:r>
     </w:p>
+    <w:p>
+      <w:pPr>
+        <w:pStyle w:val="ListBullet"/>
+      </w:pPr>
+      <w:r>
+        <w:t>`docs/reports/phase-5-agentic-cli/phase-5-agentic-cli-report.docx`</w:t>
+      </w:r>
+    </w:p>
+    <w:p>
+      <w:pPr>
+        <w:pStyle w:val="ListBullet"/>
+      </w:pPr>
+      <w:r>
+        <w:t>`docs/reports/phase-5-agentic-cli/screenshots/exported-runtime-demo.png`</w:t>
+      </w:r>
+    </w:p>
     <w:p/>
     <w:p>
       <w:pPr>
@@ -411,10 +427,17 @@
         <w:t xml:space="preserve">  - Added an integration test that runs the built `strut` binary through inspect, plan, dry-run patch, patch, verify, render, and export dry-run.</w:t>
       </w:r>
     </w:p>
-    <w:p/>
+    <w:p>
+      <w:pPr>
+        <w:pStyle w:val="ListBullet"/>
+      </w:pPr>
+      <w:r>
+        <w:t>`docs(cli): document agentic strut workflow`</w:t>
+      </w:r>
+    </w:p>
     <w:p>
       <w:r>
-        <w:t>Additional docs/report commits are expected after this report is committed.</w:t>
+        <w:t xml:space="preserve">  - Adds CLI reference docs, integration recipes, and this Phase 5 report.</w:t>
       </w:r>
     </w:p>
     <w:p/>
@@ -486,7 +509,43 @@
     <w:p/>
     <w:p>
       <w:r>
-        <w:t>Final broad verification should run before closing Phase 5.</w:t>
+        <w:t>Final broad verification:</w:t>
+      </w:r>
+    </w:p>
+    <w:p/>
+    <w:p>
+      <w:r>
+        <w:t>| Command | Result |</w:t>
+      </w:r>
+    </w:p>
+    <w:p>
+      <w:r>
+        <w:t>|---|---|</w:t>
+      </w:r>
+    </w:p>
+    <w:p>
+      <w:r>
+        <w:t>| `cargo test --workspace` | PASS, workspace tests green with 1 ignored authenticated Gemini CLI test and existing Studio dead-code warnings. |</w:t>
+      </w:r>
+    </w:p>
+    <w:p>
+      <w:r>
+        <w:t>| `npm --workspace @strut/studio run check` | PASS. |</w:t>
+      </w:r>
+    </w:p>
+    <w:p>
+      <w:r>
+        <w:t>| `npm run check` | PASS, with existing Rust dead-code warnings during `cargo check`. |</w:t>
+      </w:r>
+    </w:p>
+    <w:p>
+      <w:r>
+        <w:t>| `git diff --check` | PASS. |</w:t>
+      </w:r>
+    </w:p>
+    <w:p>
+      <w:r>
+        <w:t>| Playwright exported-runtime demo harness | PASS, rendered exported scene data in Chromium and captured `screenshots/exported-runtime-demo.png`. |</w:t>
       </w:r>
     </w:p>
     <w:p/>
@@ -501,7 +560,62 @@
     <w:p/>
     <w:p>
       <w:r>
-        <w:t>Browser visual QA is not required for the core CLI implementation because no Studio UI was changed. Exported React files are static integration code; a browser demo remains a future sample-project hardening task.</w:t>
+        <w:t>Browser plugin controls were not exposed in this thread, so browser QA used Playwright/Chromium. Result: PASS.</w:t>
+      </w:r>
+    </w:p>
+    <w:p/>
+    <w:p>
+      <w:r>
+        <w:t>Coverage:</w:t>
+      </w:r>
+    </w:p>
+    <w:p/>
+    <w:p>
+      <w:pPr>
+        <w:pStyle w:val="ListBullet"/>
+      </w:pPr>
+      <w:r>
+        <w:t>Generated a sprite-python logo plan through the CLI.</w:t>
+      </w:r>
+    </w:p>
+    <w:p>
+      <w:pPr>
+        <w:pStyle w:val="ListBullet"/>
+      </w:pPr>
+      <w:r>
+        <w:t>Patched a copied `.strut` scene after Rust validation.</w:t>
+      </w:r>
+    </w:p>
+    <w:p>
+      <w:pPr>
+        <w:pStyle w:val="ListBullet"/>
+      </w:pPr>
+      <w:r>
+        <w:t>Rendered a deterministic SVG proof.</w:t>
+      </w:r>
+    </w:p>
+    <w:p>
+      <w:pPr>
+        <w:pStyle w:val="ListBullet"/>
+      </w:pPr>
+      <w:r>
+        <w:t>Exported React integration files.</w:t>
+      </w:r>
+    </w:p>
+    <w:p>
+      <w:pPr>
+        <w:pStyle w:val="ListBullet"/>
+      </w:pPr>
+      <w:r>
+        <w:t>Loaded exported `scene.json` in a local HTML harness and rendered the scene as SVG in Chromium.</w:t>
+      </w:r>
+    </w:p>
+    <w:p>
+      <w:pPr>
+        <w:pStyle w:val="ListBullet"/>
+      </w:pPr>
+      <w:r>
+        <w:t>Captured `screenshots/exported-runtime-demo.png`.</w:t>
       </w:r>
     </w:p>
     <w:p/>
@@ -516,7 +630,7 @@
     <w:p/>
     <w:p>
       <w:r>
-        <w:t>Computer/Tauri QA was not required for core CLI commands. Phase 5 did not change Tauri UI behavior. App handoff remains documented but not implemented.</w:t>
+        <w:t>Computer/Tauri QA was not required for core CLI commands. Phase 5 did not change Tauri UI behavior. App handoff remains documented but not implemented, so no native app handoff smoke was run.</w:t>
       </w:r>
     </w:p>
     <w:p/>
@@ -576,7 +690,50 @@
         <w:t>Proceed to Phase 6 only after review. The recommended next step is end-to-end gallery hardening across dice, logo, loader, mascot, UI microinteraction, and icon/badge examples using the CLI and Studio together.</w:t>
       </w:r>
     </w:p>
-    <w:p/>
+    <w:p>
+      <w:pPr>
+        <w:pStyle w:val="Heading2"/>
+      </w:pPr>
+      <w:r>
+        <w:t>Browser Proof Screenshot</w:t>
+      </w:r>
+    </w:p>
+    <w:p>
+      <w:r>
+        <w:drawing>
+          <wp:inline xmlns:a="http://schemas.openxmlformats.org/drawingml/2006/main" xmlns:pic="http://schemas.openxmlformats.org/drawingml/2006/picture">
+            <wp:extent cx="5943600" cy="3962400"/>
+            <wp:docPr id="1" name="Picture 1"/>
+            <wp:cNvGraphicFramePr>
+              <a:graphicFrameLocks noChangeAspect="1"/>
+            </wp:cNvGraphicFramePr>
+            <a:graphic>
+              <a:graphicData uri="http://schemas.openxmlformats.org/drawingml/2006/picture">
+                <pic:pic>
+                  <pic:nvPicPr>
+                    <pic:cNvPr id="0" name="exported-runtime-demo.png"/>
+                    <pic:cNvPicPr/>
+                  </pic:nvPicPr>
+                  <pic:blipFill>
+                    <a:blip r:embed="rId9"/>
+                    <a:stretch>
+                      <a:fillRect/>
+                    </a:stretch>
+                  </pic:blipFill>
+                  <pic:spPr>
+                    <a:xfrm>
+                      <a:off x="0" y="0"/>
+                      <a:ext cx="5943600" cy="3962400"/>
+                    </a:xfrm>
+                    <a:prstGeom prst="rect"/>
+                  </pic:spPr>
+                </pic:pic>
+              </a:graphicData>
+            </a:graphic>
+          </wp:inline>
+        </w:drawing>
+      </w:r>
+    </w:p>
     <w:sectPr>
       <w:pgSz w:w="12240" w:h="15840"/>
       <w:pgMar w:top="1440" w:right="1800" w:bottom="1440" w:left="1800" w:header="720" w:footer="720" w:gutter="0"/>

</xml_diff>

<commit_message>
chore(report): refresh phase 5 review evidence
</commit_message>
<xml_diff>
--- a/docs/reports/phase-5-agentic-cli/phase-5-agentic-cli-report.docx
+++ b/docs/reports/phase-5-agentic-cli/phase-5-agentic-cli-report.docx
@@ -34,13 +34,93 @@
     <w:p/>
     <w:p>
       <w:r>
-        <w:t>Phase 5 is implemented for the core agentic workflow. Strut now has a Rust-backed `strut` CLI binary in `crates/strut-cli` that can inspect projects and scenes, generate validated operation plans, use sprite-python as a planning backend, patch `.strut` scene packages through Rust validation, verify scenes and operation batches, write deterministic SVG render proofs, and export React integration files.</w:t>
+        <w:t>Phase 5 is implemented and review-fixed for the core agentic workflow. Strut now has a Rust-backed `strut` CLI binary in `crates/strut-cli` that can inspect projects and scenes, generate validated operation plans, use sprite-python as a planning backend, patch `.strut` scene packages through Rust validation, verify scenes and operation batches, write deterministic SVG render proofs, and export React integration files.</w:t>
       </w:r>
     </w:p>
     <w:p/>
     <w:p>
       <w:r>
         <w:t>Phase 6 end-to-end gallery hardening was not started.</w:t>
+      </w:r>
+    </w:p>
+    <w:p/>
+    <w:p>
+      <w:pPr>
+        <w:pStyle w:val="Heading2"/>
+      </w:pPr>
+      <w:r>
+        <w:t>Review Fix Pass</w:t>
+      </w:r>
+    </w:p>
+    <w:p/>
+    <w:p>
+      <w:r>
+        <w:t>This review fix pass addressed two Phase 5 CLI findings without starting Phase 6.</w:t>
+      </w:r>
+    </w:p>
+    <w:p/>
+    <w:p>
+      <w:pPr>
+        <w:pStyle w:val="ListBullet"/>
+      </w:pPr>
+      <w:r>
+        <w:t>`strut patch` now derives the document to write from the validated operation batch instead of treating the top-level plan `document` as the write authority.</w:t>
+      </w:r>
+    </w:p>
+    <w:p>
+      <w:pPr>
+        <w:pStyle w:val="ListBullet"/>
+      </w:pPr>
+      <w:r>
+        <w:t>The Phase 5 patch subset now requires exactly one authoritative `replace_document` operation.</w:t>
+      </w:r>
+    </w:p>
+    <w:p>
+      <w:pPr>
+        <w:pStyle w:val="ListBullet"/>
+      </w:pPr>
+      <w:r>
+        <w:t>`patch` injects `previousDocument` from the current scene, validates `nextDocument`, validates the operation batch, requires the top-level plan `document` to exactly match `batch.operations[0].nextDocument`, and writes only that validated operation document.</w:t>
+      </w:r>
+    </w:p>
+    <w:p>
+      <w:pPr>
+        <w:pStyle w:val="ListBullet"/>
+      </w:pPr>
+      <w:r>
+        <w:t>Tampered top-level plan documents now fail with an actionable `plan document mismatch` error before mutation.</w:t>
+      </w:r>
+    </w:p>
+    <w:p>
+      <w:pPr>
+        <w:pStyle w:val="ListBullet"/>
+      </w:pPr>
+      <w:r>
+        <w:t>Invalid replacement documents fail validation before mutation.</w:t>
+      </w:r>
+    </w:p>
+    <w:p>
+      <w:pPr>
+        <w:pStyle w:val="ListBullet"/>
+      </w:pPr>
+      <w:r>
+        <w:t>`export react` now preflights every target file before writing anything.</w:t>
+      </w:r>
+    </w:p>
+    <w:p>
+      <w:pPr>
+        <w:pStyle w:val="ListBullet"/>
+      </w:pPr>
+      <w:r>
+        <w:t>If any target exists and `--force` is not set, export fails before creating `scene.json`, `StrutAnimation.tsx`, `README.md`, or parent directories for missing files.</w:t>
+      </w:r>
+    </w:p>
+    <w:p>
+      <w:pPr>
+        <w:pStyle w:val="ListBullet"/>
+      </w:pPr>
+      <w:r>
+        <w:t>`--dry-run` remains non-mutating, and `--force` overwrites the full expected export set.</w:t>
       </w:r>
     </w:p>
     <w:p/>
@@ -216,6 +296,14 @@
         <w:t>Added CLI reference and integration guide docs.</w:t>
       </w:r>
     </w:p>
+    <w:p>
+      <w:pPr>
+        <w:pStyle w:val="ListBullet"/>
+      </w:pPr>
+      <w:r>
+        <w:t>Added review-fix regression coverage for patch source-of-truth tampering, invalid replacement no-mutation, export conflict atomicity, force overwrite, and dry-run no-mutation.</w:t>
+      </w:r>
+    </w:p>
     <w:p/>
     <w:p>
       <w:pPr>
@@ -228,7 +316,7 @@
     <w:p/>
     <w:p>
       <w:r>
-        <w:t>The CLI writes only after Rust reads and validates the current `.strut` package, validates the planned replacement `Document` through `strut-format`, validates the pending operation batch shape, and writes a new `.strut` package through `strut_format::write_strut_file`.</w:t>
+        <w:t>The CLI writes only after Rust reads and validates the current `.strut` package, extracts the single authoritative `replace_document.nextDocument` from the operation batch, validates it through `strut-format`, validates the pending operation batch shape, checks it matches the top-level plan document, and writes a new `.strut` package through `strut_format::write_strut_file`.</w:t>
       </w:r>
     </w:p>
     <w:p/>
@@ -432,12 +520,53 @@
         <w:pStyle w:val="ListBullet"/>
       </w:pPr>
       <w:r>
-        <w:t>`docs(cli): document agentic strut workflow`</w:t>
+        <w:t>`68ba07c docs(cli): document agentic strut workflow`</w:t>
       </w:r>
     </w:p>
     <w:p>
       <w:r>
         <w:t xml:space="preserve">  - Adds CLI reference docs, integration recipes, and this Phase 5 report.</w:t>
+      </w:r>
+    </w:p>
+    <w:p>
+      <w:pPr>
+        <w:pStyle w:val="ListBullet"/>
+      </w:pPr>
+      <w:r>
+        <w:t>`5e8abd3 chore(report): add phase 5 cli evidence`</w:t>
+      </w:r>
+    </w:p>
+    <w:p>
+      <w:r>
+        <w:t xml:space="preserve">  - Added exported-runtime browser proof evidence and refreshed the Phase 5 report.</w:t>
+      </w:r>
+    </w:p>
+    <w:p>
+      <w:pPr>
+        <w:pStyle w:val="ListBullet"/>
+      </w:pPr>
+      <w:r>
+        <w:t>`7143100 fix(cli): harden patch and export writes`</w:t>
+      </w:r>
+    </w:p>
+    <w:p>
+      <w:r>
+        <w:t xml:space="preserve">  - Made patch use the validated `replace_document.nextDocument` as the write authority.</w:t>
+      </w:r>
+    </w:p>
+    <w:p>
+      <w:r>
+        <w:t xml:space="preserve">  - Rejected top-level document and operation-document mismatches before mutation.</w:t>
+      </w:r>
+    </w:p>
+    <w:p>
+      <w:r>
+        <w:t xml:space="preserve">  - Added atomic React export preflight before any writes.</w:t>
+      </w:r>
+    </w:p>
+    <w:p>
+      <w:r>
+        <w:t xml:space="preserve">  - Added focused regression tests for both review findings.</w:t>
       </w:r>
     </w:p>
     <w:p/>
@@ -468,12 +597,22 @@
     </w:p>
     <w:p>
       <w:r>
-        <w:t>| `cargo test -p strut-cli` | PASS, 3 unit tests and 1 integration test. |</w:t>
+        <w:t>| `cargo test -p strut-cli` | PASS, 3 unit tests and 4 integration tests. |</w:t>
       </w:r>
     </w:p>
     <w:p>
       <w:r>
-        <w:t>| `$env:PYTHONPATH='src'; python -m pytest tests` from `packages/strut-python` | PASS, 22 tests. |</w:t>
+        <w:t>| `python -m pytest packages/strut-python/tests` | PASS, 22 tests. |</w:t>
+      </w:r>
+    </w:p>
+    <w:p>
+      <w:r>
+        <w:t>| From `packages/strut-python`: `$env:PYTHONPATH='src'; python -m strut_python.cli loader --json --out $env:TEMP\strut-loader-plan.json` | PASS. |</w:t>
+      </w:r>
+    </w:p>
+    <w:p>
+      <w:r>
+        <w:t>| `cargo fmt --all --check` | PASS. |</w:t>
       </w:r>
     </w:p>
     <w:p>
@@ -506,6 +645,11 @@
         <w:t>| `target\debug\strut.exe export react --scene &lt;temp&gt;\scene.strut --out &lt;temp&gt;\react-export --dry-run --json` | PASS. |</w:t>
       </w:r>
     </w:p>
+    <w:p>
+      <w:r>
+        <w:t>| Review-fix regression tests in `crates/strut-cli/tests/agentic_cli.rs` | PASS, patch tamper/no-mutation and export atomicity covered. |</w:t>
+      </w:r>
+    </w:p>
     <w:p/>
     <w:p>
       <w:r>
@@ -536,6 +680,21 @@
     <w:p>
       <w:r>
         <w:t>| `npm run check` | PASS, with existing Rust dead-code warnings during `cargo check`. |</w:t>
+      </w:r>
+    </w:p>
+    <w:p>
+      <w:r>
+        <w:t>| `python tests/ui/studio_bot_smoke.py` | PASS. |</w:t>
+      </w:r>
+    </w:p>
+    <w:p>
+      <w:r>
+        <w:t>| `python tests/ui/studio_persistence_smoke.py` | PASS. |</w:t>
+      </w:r>
+    </w:p>
+    <w:p>
+      <w:r>
+        <w:t>| `python tests/ui/studio_tauri_persistence_smoke.py` | PASS. |</w:t>
       </w:r>
     </w:p>
     <w:p>

</xml_diff>